<commit_message>
Refine prompt set: Japanese female doctor, doctor-left/patient-right layout
</commit_message>
<xml_diff>
--- a/Veo3_プロンプト_女性医師_90度構図.docx
+++ b/Veo3_プロンプト_女性医師_90度構図.docx
@@ -15,7 +15,7 @@
           <w:sz w:val="30"/>
           <w:szCs w:val="30"/>
         </w:rPr>
-        <w:t xml:space="preserve">Veo 3.1 プロンプト集 — 女性医師・90度対面（日本式）版</w:t>
+        <w:t xml:space="preserve">Veo 3.1 プロンプト集（確定）— 日本人女性医師・90度対面（日本式）版</w:t>
       </w:r>
     </w:p>
     <w:p>
@@ -30,7 +30,7 @@
           <w:sz w:val="19"/>
           <w:szCs w:val="19"/>
         </w:rPr>
-        <w:t xml:space="preserve">女性医師 × ベトナム人男性患者／机の角で90度に向かい合う日本式構図／写り込み対策(キーフレーム固定)反映</w:t>
+        <w:t xml:space="preserve">日本人女性医師 × ベトナム人男性患者／机の角で90度／画面左＝医師・右＝患者／写り込み対策(キーフレーム固定)反映</w:t>
       </w:r>
     </w:p>
     <w:p>
@@ -46,7 +46,7 @@
           <w:sz w:val="28"/>
           <w:szCs w:val="28"/>
         </w:rPr>
-        <w:t xml:space="preserve">今回の変更点</w:t>
+        <w:t xml:space="preserve">今回の設定（確定）</w:t>
       </w:r>
     </w:p>
     <w:p>
@@ -64,7 +64,7 @@
           <w:sz w:val="21"/>
           <w:szCs w:val="21"/>
         </w:rPr>
-        <w:t xml:space="preserve">医師：女性に変更（she/her、白衣）。</w:t>
+        <w:t xml:space="preserve">医師：日本人・女性（she/her、白衣）。</w:t>
       </w:r>
     </w:p>
     <w:p>
@@ -83,6 +83,24 @@
           <w:szCs w:val="21"/>
         </w:rPr>
         <w:t xml:space="preserve">患者：ベトナム人男性（変更なし）。</w:t>
+      </w:r>
+    </w:p>
+    <w:p>
+      <w:pPr>
+        <w:pStyle w:val="ListParagraph"/>
+        <w:numPr>
+          <w:ilvl w:val="0"/>
+          <w:numId w:val="2"/>
+        </w:numPr>
+        <w:spacing w:after="70" w:line="316"/>
+      </w:pPr>
+      <w:r>
+        <w:rPr>
+          <w:rFonts w:ascii="Yu Gothic" w:cs="Yu Gothic" w:eastAsia="Yu Gothic" w:hAnsi="Yu Gothic"/>
+          <w:sz w:val="21"/>
+          <w:szCs w:val="21"/>
+        </w:rPr>
+        <w:t xml:space="preserve">配置：画面の【左＝医師】／【右＝患者】（あなたから見て左に医師、右に患者）。</w:t>
       </w:r>
     </w:p>
     <w:p>
@@ -144,10 +162,12 @@
       <w:r>
         <w:rPr>
           <w:rFonts w:ascii="Yu Gothic" w:cs="Yu Gothic" w:eastAsia="Yu Gothic" w:hAnsi="Yu Gothic"/>
+          <w:b/>
+          <w:bCs/>
           <w:sz w:val="21"/>
           <w:szCs w:val="21"/>
         </w:rPr>
-        <w:t xml:space="preserve">机を壁付けにし、医師は机のスツールに座る。患者は机の『角』の椅子に座り、医師と90度の位置関係になる（正面から対峙しない、日本の診察室で一般的なレイアウト）。</w:t>
+        <w:t xml:space="preserve">机を壁付けにし、医師は机のスツールに座る。患者は机の『角』の椅子に座り、医師と90度の位置関係になる（正面から対峙しない、日本の診察室で一般的なレイアウト）。左右は【画面左＝医師／画面右＝患者】で固定。</w:t>
       </w:r>
     </w:p>
     <w:p>
@@ -165,7 +185,7 @@
           <w:sz w:val="21"/>
           <w:szCs w:val="21"/>
         </w:rPr>
-        <w:t xml:space="preserve">医師の単独ショット：医師は患者方向（画面右寄り）を向く。相手（患者）の椅子は空のまま写す。</w:t>
+        <w:t xml:space="preserve">医師の単独ショット：医師は画面左に位置し、右（患者方向）を向く。相手（患者）の椅子は空のまま写す。</w:t>
       </w:r>
     </w:p>
     <w:p>
@@ -183,7 +203,7 @@
           <w:sz w:val="21"/>
           <w:szCs w:val="21"/>
         </w:rPr>
-        <w:t xml:space="preserve">患者の単独ショット：患者は医師方向（画面左寄り）を向く。相手（医師）のスツールは空のまま写す。</w:t>
+        <w:t xml:space="preserve">患者の単独ショット：患者は画面右に位置し、左（医師方向）を向く。相手（医師）のスツールは空のまま写す。</w:t>
       </w:r>
     </w:p>
     <w:p>
@@ -278,7 +298,7 @@
                 <w:sz w:val="19"/>
                 <w:szCs w:val="19"/>
               </w:rPr>
-              <w:t xml:space="preserve">Photorealistic character reference of a warm, professional FEMALE doctor, Japanese, late 30s to early 40s, neat shoulder-length black hair, white coat over a soft blouse, stethoscope, calm reassuring expression. Front view, waist-up, neutral studio lighting, plain light-gray background. Consistent face, no text, no watermark. 16:9.  ※医師の人種を変えたい場合は "Japanese" を希望の民族に置換。</w:t>
+              <w:t xml:space="preserve">Photorealistic character reference of a warm, professional Japanese FEMALE doctor, late 30s to early 40s, neat shoulder-length black hair, white coat over a soft blouse, stethoscope, calm reassuring expression. Front view, waist-up, neutral studio lighting, plain light-gray background. Consistent face, no text, no watermark. 16:9.</w:t>
             </w:r>
           </w:p>
         </w:tc>
@@ -504,7 +524,7 @@
                 <w:sz w:val="19"/>
                 <w:szCs w:val="19"/>
               </w:rPr>
-              <w:t xml:space="preserve">Using the female doctor reference, compose a photorealistic still in the same Japanese clinic room: the SAME female doctor seated on the rolling stool at the desk, her body angled about 90 degrees toward an EMPTY patient chair at the corner of the desk (Japanese corner-seating). She is turned to face the empty patient seat, looking screen-RIGHT. The desk with monitor is beside her. Only ONE person (the doctor); the patient chair is clearly EMPTY. Medium shot, soft daylight, 16:9. No other person, no back of head, no text, no watermark.</w:t>
+              <w:t xml:space="preserve">Using the female doctor reference, compose a photorealistic still in the same Japanese clinic room: the SAME Japanese female doctor seated on the rolling stool at the desk, positioned on the LEFT side of the frame, her body angled about 90 degrees toward an EMPTY patient chair at the corner of the desk (Japanese corner-seating). She is turned to face the empty patient seat, looking screen-RIGHT. The desk with monitor is beside her. Only ONE person (the doctor); the patient chair is clearly EMPTY. Medium shot, soft daylight, 16:9. No other person, no back of head, no text, no watermark.</w:t>
             </w:r>
           </w:p>
         </w:tc>
@@ -568,7 +588,7 @@
                 <w:sz w:val="19"/>
                 <w:szCs w:val="19"/>
               </w:rPr>
-              <w:t xml:space="preserve">Using the patient reference, compose a photorealistic still in the same Japanese clinic room: the SAME 25-year-old Vietnamese man seated in the patient chair at the CORNER of the desk, his body angled about 90 degrees toward the EMPTY doctor's stool (Japanese corner-seating). He is turned to face the empty doctor seat, looking screen-LEFT. The desk corner is beside him. Only ONE person (the patient); the doctor's stool is clearly EMPTY. Close-up, soft daylight, 16:9. No other person, no back of head, no text, no watermark.</w:t>
+              <w:t xml:space="preserve">Using the patient reference, compose a photorealistic still in the same Japanese clinic room: the SAME 25-year-old Vietnamese man seated in the patient chair at the CORNER of the desk, positioned on the RIGHT side of the frame, his body angled about 90 degrees toward the EMPTY doctor's stool (Japanese corner-seating). He is turned to face the empty doctor seat, looking screen-LEFT. The desk corner is beside him. Only ONE person (the patient); the doctor's stool is clearly EMPTY. Close-up, soft daylight, 16:9. No other person, no back of head, no text, no watermark.</w:t>
             </w:r>
           </w:p>
         </w:tc>

</xml_diff>